<commit_message>
Correct company name to Scanditech Solutions Pvt Ltd
</commit_message>
<xml_diff>
--- a/resume/Suraj_Kesharwani_DotNet_Developer.docx
+++ b/resume/Suraj_Kesharwani_DotNet_Developer.docx
@@ -55,7 +55,7 @@
         </w:rPr>
         <w:t xml:space="preserve"> | </w:t>
       </w:r>
-      <w:hyperlink w:history="1" r:id="rIdkr1ihpiqtpjhjtbmh_u9e">
+      <w:hyperlink w:history="1" r:id="rIdphmcd3z1cx8cip94mdbik">
         <w:r>
           <w:rPr>
             <w:rFonts w:ascii="Calibri" w:cs="Calibri" w:eastAsia="Calibri" w:hAnsi="Calibri"/>
@@ -76,7 +76,7 @@
         </w:rPr>
         <w:t xml:space="preserve"> | </w:t>
       </w:r>
-      <w:hyperlink w:history="1" r:id="rIdlxpr3ed0p2nfpnn7cefat">
+      <w:hyperlink w:history="1" r:id="rIdwvkytpe3ym-xbnr_4zwt2">
         <w:r>
           <w:rPr>
             <w:rFonts w:ascii="Calibri" w:cs="Calibri" w:eastAsia="Calibri" w:hAnsi="Calibri"/>
@@ -97,7 +97,7 @@
         </w:rPr>
         <w:t xml:space="preserve"> | </w:t>
       </w:r>
-      <w:hyperlink w:history="1" r:id="rId_aeg5rfycg793tytd3tba">
+      <w:hyperlink w:history="1" r:id="rId1sqqwlknkwejzlqxxyypt">
         <w:r>
           <w:rPr>
             <w:rFonts w:ascii="Calibri" w:cs="Calibri" w:eastAsia="Calibri" w:hAnsi="Calibri"/>
@@ -178,7 +178,7 @@
           <w:sz w:val="20"/>
           <w:szCs w:val="20"/>
         </w:rPr>
-        <w:t xml:space="preserve">Software Developer (.NET Full-Stack) — Scanditech Solution Pvt Ltd, Faridabad, Haryana</w:t>
+        <w:t xml:space="preserve">Software Developer (.NET Full-Stack) — Scanditech Solutions Pvt Ltd, Faridabad, Haryana</w:t>
       </w:r>
       <w:r>
         <w:rPr>

</xml_diff>